<commit_message>
Entrega practica p7 y documento final
</commit_message>
<xml_diff>
--- a/p6/Prractica6-UO307004.docx
+++ b/p6/Prractica6-UO307004.docx
@@ -91,7 +91,7 @@
           </w:tcPr>
           <w:p>
             <w:r>
-              <w:t>34</w:t>
+              <w:t>477</w:t>
             </w:r>
           </w:p>
         </w:tc>
@@ -299,6 +299,9 @@
     </w:tbl>
     <w:p/>
     <w:p>
+      <w:pPr>
+        <w:jc w:val="both"/>
+      </w:pPr>
       <w:r>
         <w:t>El algoritmo tiene una complejidad O(</w:t>
       </w:r>

</xml_diff>